<commit_message>
fix: dashboard chart mapping error
</commit_message>
<xml_diff>
--- a/dist/templates/sk-gtt-template.docx
+++ b/dist/templates/sk-gtt-template.docx
@@ -36,7 +36,6 @@
           <w:bCs/>
           <w:sz w:val="20"/>
           <w:szCs w:val="20"/>
-          <w:lang w:val="en-US"/>
         </w:rPr>
       </w:pPr>
       <w:r>
@@ -51,7 +50,7 @@
       <w:r>
         <w:rPr>
           <w:rFonts w:ascii="Arial Narrow" w:hAnsi="Arial Narrow" w:cs="Times New Roman"/>
-          <w:bCs/>
+          <w:b/>
           <w:sz w:val="20"/>
           <w:szCs w:val="20"/>
         </w:rPr>
@@ -60,7 +59,7 @@
       <w:r>
         <w:rPr>
           <w:rFonts w:ascii="Consolas" w:hAnsi="Consolas" w:cs="Times New Roman"/>
-          <w:bCs/>
+          <w:b/>
           <w:sz w:val="20"/>
           <w:szCs w:val="20"/>
         </w:rPr>
@@ -69,7 +68,7 @@
       <w:r>
         <w:rPr>
           <w:rFonts w:ascii="Consolas" w:hAnsi="Consolas" w:cs="Times New Roman"/>
-          <w:bCs/>
+          <w:b/>
           <w:sz w:val="20"/>
           <w:szCs w:val="20"/>
         </w:rPr>
@@ -78,7 +77,7 @@
       <w:r>
         <w:rPr>
           <w:rFonts w:ascii="Consolas" w:hAnsi="Consolas" w:cs="Times New Roman"/>
-          <w:bCs/>
+          <w:b/>
           <w:sz w:val="20"/>
           <w:szCs w:val="20"/>
         </w:rPr>
@@ -87,77 +86,17 @@
       <w:r>
         <w:rPr>
           <w:rFonts w:ascii="Consolas" w:hAnsi="Consolas" w:cs="Times New Roman"/>
-          <w:bCs/>
+          <w:b/>
           <w:noProof/>
           <w:sz w:val="20"/>
           <w:szCs w:val="20"/>
         </w:rPr>
-        <w:t>NOMOR}</w:t>
+        <w:t>NOMOR}/PC.L/A.II/H-34.B/24.29/{TANGGAL}/{BULAN}/{</w:t>
       </w:r>
       <w:r>
         <w:rPr>
           <w:rFonts w:ascii="Consolas" w:hAnsi="Consolas" w:cs="Times New Roman"/>
-          <w:bCs/>
-          <w:noProof/>
-          <w:sz w:val="20"/>
-          <w:szCs w:val="20"/>
-        </w:rPr>
-        <w:t>/PC.L/A.II/H-34.B/24.29/</w:t>
-      </w:r>
-      <w:r>
-        <w:rPr>
-          <w:rFonts w:ascii="Consolas" w:hAnsi="Consolas" w:cs="Times New Roman"/>
-          <w:bCs/>
-          <w:noProof/>
-          <w:sz w:val="20"/>
-          <w:szCs w:val="20"/>
-        </w:rPr>
-        <w:t>{TANGGAL}</w:t>
-      </w:r>
-      <w:r>
-        <w:rPr>
-          <w:rFonts w:ascii="Consolas" w:hAnsi="Consolas" w:cs="Times New Roman"/>
-          <w:bCs/>
-          <w:noProof/>
-          <w:sz w:val="20"/>
-          <w:szCs w:val="20"/>
-        </w:rPr>
-        <w:t>/</w:t>
-      </w:r>
-      <w:r>
-        <w:rPr>
-          <w:rFonts w:ascii="Consolas" w:hAnsi="Consolas" w:cs="Times New Roman"/>
-          <w:bCs/>
-          <w:noProof/>
-          <w:sz w:val="20"/>
-          <w:szCs w:val="20"/>
-        </w:rPr>
-        <w:t>{BULAN}</w:t>
-      </w:r>
-      <w:r>
-        <w:rPr>
-          <w:rFonts w:ascii="Consolas" w:hAnsi="Consolas" w:cs="Times New Roman"/>
-          <w:bCs/>
-          <w:noProof/>
-          <w:sz w:val="20"/>
-          <w:szCs w:val="20"/>
-        </w:rPr>
-        <w:t>/</w:t>
-      </w:r>
-      <w:r>
-        <w:rPr>
-          <w:rFonts w:ascii="Consolas" w:hAnsi="Consolas" w:cs="Times New Roman"/>
-          <w:bCs/>
-          <w:noProof/>
-          <w:sz w:val="20"/>
-          <w:szCs w:val="20"/>
-        </w:rPr>
-        <w:t>{</w:t>
-      </w:r>
-      <w:r>
-        <w:rPr>
-          <w:rFonts w:ascii="Consolas" w:hAnsi="Consolas" w:cs="Times New Roman"/>
-          <w:bCs/>
+          <w:b/>
           <w:sz w:val="20"/>
           <w:szCs w:val="20"/>
         </w:rPr>
@@ -166,7 +105,7 @@
       <w:r>
         <w:rPr>
           <w:rFonts w:ascii="Consolas" w:hAnsi="Consolas" w:cs="Times New Roman"/>
-          <w:bCs/>
+          <w:b/>
           <w:sz w:val="20"/>
           <w:szCs w:val="20"/>
         </w:rPr>
@@ -2787,7 +2726,37 @@
                 <w:szCs w:val="20"/>
                 <w:lang w:val="en-US" w:eastAsia="ko-KR"/>
               </w:rPr>
-              <w:fldChar w:fldCharType="begin"/>
+              <w:t>{UNIT KERJA}</w:t>
+            </w:r>
+            <w:r>
+              <w:rPr>
+                <w:rFonts w:ascii="Arial Narrow" w:eastAsia="Times New Roman" w:hAnsi="Arial Narrow" w:cs="Calibri"/>
+                <w:color w:val="000000"/>
+                <w:sz w:val="20"/>
+                <w:szCs w:val="20"/>
+                <w:lang w:eastAsia="ko-KR"/>
+              </w:rPr>
+              <w:t xml:space="preserve"> Nomor </w:t>
+            </w:r>
+            <w:r>
+              <w:rPr>
+                <w:rFonts w:ascii="Arial Narrow" w:eastAsia="Times New Roman" w:hAnsi="Arial Narrow" w:cs="Calibri"/>
+                <w:color w:val="000000"/>
+                <w:sz w:val="20"/>
+                <w:szCs w:val="20"/>
+                <w:lang w:eastAsia="ko-KR"/>
+              </w:rPr>
+              <w:t>{NOMOR SURAT PERMOHONAN}</w:t>
+            </w:r>
+            <w:r>
+              <w:rPr>
+                <w:rFonts w:ascii="Arial Narrow" w:eastAsia="Times New Roman" w:hAnsi="Arial Narrow" w:cs="Calibri"/>
+                <w:color w:val="000000"/>
+                <w:sz w:val="20"/>
+                <w:szCs w:val="20"/>
+                <w:lang w:eastAsia="ko-KR"/>
+              </w:rPr>
+              <w:t xml:space="preserve"> Tanggal</w:t>
             </w:r>
             <w:r>
               <w:rPr>
@@ -2797,7 +2766,7 @@
                 <w:szCs w:val="20"/>
                 <w:lang w:val="en-US" w:eastAsia="ko-KR"/>
               </w:rPr>
-              <w:instrText xml:space="preserve"> MERGEFIELD "NAMA_MADRASAH_" </w:instrText>
+              <w:t xml:space="preserve"> </w:t>
             </w:r>
             <w:r>
               <w:rPr>
@@ -2807,160 +2776,7 @@
                 <w:szCs w:val="20"/>
                 <w:lang w:val="en-US" w:eastAsia="ko-KR"/>
               </w:rPr>
-              <w:fldChar w:fldCharType="separate"/>
-            </w:r>
-            <w:r>
-              <w:rPr>
-                <w:rFonts w:ascii="Arial Narrow" w:eastAsia="Times New Roman" w:hAnsi="Arial Narrow" w:cs="Calibri"/>
-                <w:noProof/>
-                <w:color w:val="000000"/>
-                <w:sz w:val="20"/>
-                <w:szCs w:val="20"/>
-                <w:lang w:val="en-US" w:eastAsia="ko-KR"/>
-              </w:rPr>
-              <w:t>MI Tarbiyah Mu'awanah Danasri Lor</w:t>
-            </w:r>
-            <w:r>
-              <w:rPr>
-                <w:rFonts w:ascii="Arial Narrow" w:eastAsia="Times New Roman" w:hAnsi="Arial Narrow" w:cs="Calibri"/>
-                <w:color w:val="000000"/>
-                <w:sz w:val="20"/>
-                <w:szCs w:val="20"/>
-                <w:lang w:val="en-US" w:eastAsia="ko-KR"/>
-              </w:rPr>
-              <w:fldChar w:fldCharType="end"/>
-            </w:r>
-            <w:r>
-              <w:rPr>
-                <w:rFonts w:ascii="Arial Narrow" w:eastAsia="Times New Roman" w:hAnsi="Arial Narrow" w:cs="Calibri"/>
-                <w:color w:val="000000"/>
-                <w:sz w:val="20"/>
-                <w:szCs w:val="20"/>
-                <w:lang w:eastAsia="ko-KR"/>
-              </w:rPr>
-              <w:t xml:space="preserve"> Nomor </w:t>
-            </w:r>
-            <w:r>
-              <w:rPr>
-                <w:rFonts w:ascii="Arial Narrow" w:eastAsia="Times New Roman" w:hAnsi="Arial Narrow" w:cs="Calibri"/>
-                <w:color w:val="000000"/>
-                <w:sz w:val="20"/>
-                <w:szCs w:val="20"/>
-                <w:lang w:eastAsia="ko-KR"/>
-              </w:rPr>
-              <w:fldChar w:fldCharType="begin"/>
-            </w:r>
-            <w:r>
-              <w:rPr>
-                <w:rFonts w:ascii="Arial Narrow" w:eastAsia="Times New Roman" w:hAnsi="Arial Narrow" w:cs="Calibri"/>
-                <w:color w:val="000000"/>
-                <w:sz w:val="20"/>
-                <w:szCs w:val="20"/>
-                <w:lang w:eastAsia="ko-KR"/>
-              </w:rPr>
-              <w:instrText xml:space="preserve"> MERGEFIELD "NOMOR_SURAT" </w:instrText>
-            </w:r>
-            <w:r>
-              <w:rPr>
-                <w:rFonts w:ascii="Arial Narrow" w:eastAsia="Times New Roman" w:hAnsi="Arial Narrow" w:cs="Calibri"/>
-                <w:color w:val="000000"/>
-                <w:sz w:val="20"/>
-                <w:szCs w:val="20"/>
-                <w:lang w:eastAsia="ko-KR"/>
-              </w:rPr>
-              <w:fldChar w:fldCharType="separate"/>
-            </w:r>
-            <w:r>
-              <w:rPr>
-                <w:rFonts w:ascii="Arial Narrow" w:eastAsia="Times New Roman" w:hAnsi="Arial Narrow" w:cs="Calibri"/>
-                <w:noProof/>
-                <w:color w:val="000000"/>
-                <w:sz w:val="20"/>
-                <w:szCs w:val="20"/>
-                <w:lang w:eastAsia="ko-KR"/>
-              </w:rPr>
-              <w:t>91/MITM/2706/VI/2025</w:t>
-            </w:r>
-            <w:r>
-              <w:rPr>
-                <w:rFonts w:ascii="Arial Narrow" w:eastAsia="Times New Roman" w:hAnsi="Arial Narrow" w:cs="Calibri"/>
-                <w:color w:val="000000"/>
-                <w:sz w:val="20"/>
-                <w:szCs w:val="20"/>
-                <w:lang w:eastAsia="ko-KR"/>
-              </w:rPr>
-              <w:fldChar w:fldCharType="end"/>
-            </w:r>
-            <w:r>
-              <w:rPr>
-                <w:rFonts w:ascii="Arial Narrow" w:eastAsia="Times New Roman" w:hAnsi="Arial Narrow" w:cs="Calibri"/>
-                <w:color w:val="000000"/>
-                <w:sz w:val="20"/>
-                <w:szCs w:val="20"/>
-                <w:lang w:eastAsia="ko-KR"/>
-              </w:rPr>
-              <w:t xml:space="preserve"> Tanggal</w:t>
-            </w:r>
-            <w:r>
-              <w:rPr>
-                <w:rFonts w:ascii="Arial Narrow" w:eastAsia="Times New Roman" w:hAnsi="Arial Narrow" w:cs="Calibri"/>
-                <w:color w:val="000000"/>
-                <w:sz w:val="20"/>
-                <w:szCs w:val="20"/>
-                <w:lang w:val="en-US" w:eastAsia="ko-KR"/>
-              </w:rPr>
-              <w:t xml:space="preserve"> </w:t>
-            </w:r>
-            <w:r>
-              <w:rPr>
-                <w:rFonts w:ascii="Arial Narrow" w:eastAsia="Times New Roman" w:hAnsi="Arial Narrow" w:cs="Calibri"/>
-                <w:color w:val="000000"/>
-                <w:sz w:val="20"/>
-                <w:szCs w:val="20"/>
-                <w:lang w:val="en-US" w:eastAsia="ko-KR"/>
-              </w:rPr>
-              <w:fldChar w:fldCharType="begin"/>
-            </w:r>
-            <w:r>
-              <w:rPr>
-                <w:rFonts w:ascii="Arial Narrow" w:eastAsia="Times New Roman" w:hAnsi="Arial Narrow" w:cs="Calibri"/>
-                <w:color w:val="000000"/>
-                <w:sz w:val="20"/>
-                <w:szCs w:val="20"/>
-                <w:lang w:val="en-US" w:eastAsia="ko-KR"/>
-              </w:rPr>
-              <w:instrText xml:space="preserve"> MERGEFIELD "TANGGAL_SURAT" </w:instrText>
-            </w:r>
-            <w:r>
-              <w:rPr>
-                <w:rFonts w:ascii="Arial Narrow" w:eastAsia="Times New Roman" w:hAnsi="Arial Narrow" w:cs="Calibri"/>
-                <w:color w:val="000000"/>
-                <w:sz w:val="20"/>
-                <w:szCs w:val="20"/>
-                <w:lang w:val="en-US" w:eastAsia="ko-KR"/>
-              </w:rPr>
-              <w:fldChar w:fldCharType="separate"/>
-            </w:r>
-            <w:r>
-              <w:rPr>
-                <w:rFonts w:ascii="Arial Narrow" w:eastAsia="Times New Roman" w:hAnsi="Arial Narrow" w:cs="Calibri"/>
-                <w:noProof/>
-                <w:color w:val="000000"/>
-                <w:sz w:val="20"/>
-                <w:szCs w:val="20"/>
-                <w:lang w:val="en-US" w:eastAsia="ko-KR"/>
-              </w:rPr>
-              <w:t>16 Juni 2025</w:t>
-            </w:r>
-            <w:r>
-              <w:rPr>
-                <w:rFonts w:ascii="Arial Narrow" w:eastAsia="Times New Roman" w:hAnsi="Arial Narrow" w:cs="Calibri"/>
-                <w:color w:val="000000"/>
-                <w:sz w:val="20"/>
-                <w:szCs w:val="20"/>
-                <w:lang w:val="en-US" w:eastAsia="ko-KR"/>
-              </w:rPr>
-              <w:fldChar w:fldCharType="end"/>
+              <w:t>{TANGGAL SURAT PERMOHONAN}</w:t>
             </w:r>
             <w:r>
               <w:rPr>
@@ -4614,48 +4430,7 @@
                 <w:szCs w:val="20"/>
                 <w:lang w:eastAsia="ko-KR"/>
               </w:rPr>
-              <w:fldChar w:fldCharType="begin"/>
-            </w:r>
-            <w:r>
-              <w:rPr>
-                <w:rFonts w:ascii="Arial Narrow" w:eastAsia="Times New Roman" w:hAnsi="Arial Narrow" w:cs="Calibri"/>
-                <w:color w:val="000000"/>
-                <w:sz w:val="20"/>
-                <w:szCs w:val="20"/>
-                <w:lang w:eastAsia="ko-KR"/>
-              </w:rPr>
-              <w:instrText xml:space="preserve"> MERGEFIELD "TANGGAL_TUGAS" </w:instrText>
-            </w:r>
-            <w:r>
-              <w:rPr>
-                <w:rFonts w:ascii="Arial Narrow" w:eastAsia="Times New Roman" w:hAnsi="Arial Narrow" w:cs="Calibri"/>
-                <w:color w:val="000000"/>
-                <w:sz w:val="20"/>
-                <w:szCs w:val="20"/>
-                <w:lang w:eastAsia="ko-KR"/>
-              </w:rPr>
-              <w:fldChar w:fldCharType="separate"/>
-            </w:r>
-            <w:r>
-              <w:rPr>
-                <w:rFonts w:ascii="Arial Narrow" w:eastAsia="Times New Roman" w:hAnsi="Arial Narrow" w:cs="Calibri"/>
-                <w:noProof/>
-                <w:color w:val="000000"/>
-                <w:sz w:val="20"/>
-                <w:szCs w:val="20"/>
-                <w:lang w:eastAsia="ko-KR"/>
-              </w:rPr>
-              <w:t>14 Juli 2025</w:t>
-            </w:r>
-            <w:r>
-              <w:rPr>
-                <w:rFonts w:ascii="Arial Narrow" w:eastAsia="Times New Roman" w:hAnsi="Arial Narrow" w:cs="Calibri"/>
-                <w:color w:val="000000"/>
-                <w:sz w:val="20"/>
-                <w:szCs w:val="20"/>
-                <w:lang w:eastAsia="ko-KR"/>
-              </w:rPr>
-              <w:fldChar w:fldCharType="end"/>
+              <w:t>{TANGGAL PENETAPAN}</w:t>
             </w:r>
             <w:r>
               <w:rPr>
@@ -4806,48 +4581,7 @@
                 <w:szCs w:val="20"/>
                 <w:lang w:eastAsia="ko-KR"/>
               </w:rPr>
-              <w:fldChar w:fldCharType="begin"/>
-            </w:r>
-            <w:r>
-              <w:rPr>
-                <w:rFonts w:ascii="Arial Narrow" w:eastAsia="Times New Roman" w:hAnsi="Arial Narrow" w:cs="Calibri"/>
-                <w:color w:val="000000"/>
-                <w:sz w:val="20"/>
-                <w:szCs w:val="20"/>
-                <w:lang w:eastAsia="ko-KR"/>
-              </w:rPr>
-              <w:instrText xml:space="preserve"> MERGEFIELD "NAMA_MADRASAH_" </w:instrText>
-            </w:r>
-            <w:r>
-              <w:rPr>
-                <w:rFonts w:ascii="Arial Narrow" w:eastAsia="Times New Roman" w:hAnsi="Arial Narrow" w:cs="Calibri"/>
-                <w:color w:val="000000"/>
-                <w:sz w:val="20"/>
-                <w:szCs w:val="20"/>
-                <w:lang w:eastAsia="ko-KR"/>
-              </w:rPr>
-              <w:fldChar w:fldCharType="separate"/>
-            </w:r>
-            <w:r>
-              <w:rPr>
-                <w:rFonts w:ascii="Arial Narrow" w:eastAsia="Times New Roman" w:hAnsi="Arial Narrow" w:cs="Calibri"/>
-                <w:noProof/>
-                <w:color w:val="000000"/>
-                <w:sz w:val="20"/>
-                <w:szCs w:val="20"/>
-                <w:lang w:eastAsia="ko-KR"/>
-              </w:rPr>
-              <w:t>MI Tarbiyah Mu'awanah Danasri Lor</w:t>
-            </w:r>
-            <w:r>
-              <w:rPr>
-                <w:rFonts w:ascii="Arial Narrow" w:eastAsia="Times New Roman" w:hAnsi="Arial Narrow" w:cs="Calibri"/>
-                <w:color w:val="000000"/>
-                <w:sz w:val="20"/>
-                <w:szCs w:val="20"/>
-                <w:lang w:eastAsia="ko-KR"/>
-              </w:rPr>
-              <w:fldChar w:fldCharType="end"/>
+              <w:t>{UNIT KERJA}</w:t>
             </w:r>
             <w:r>
               <w:rPr>
@@ -4875,50 +4609,9 @@
                 <w:color w:val="000000"/>
                 <w:sz w:val="20"/>
                 <w:szCs w:val="20"/>
-                <w:lang w:val="en-US" w:eastAsia="ko-KR"/>
-              </w:rPr>
-              <w:fldChar w:fldCharType="begin"/>
-            </w:r>
-            <w:r>
-              <w:rPr>
-                <w:rFonts w:ascii="Arial Narrow" w:eastAsia="Times New Roman" w:hAnsi="Arial Narrow" w:cs="Calibri"/>
-                <w:color w:val="000000"/>
-                <w:sz w:val="20"/>
-                <w:szCs w:val="20"/>
-                <w:lang w:eastAsia="ko-KR"/>
-              </w:rPr>
-              <w:instrText xml:space="preserve"> MERGEFIELD "THN_PLJN_" </w:instrText>
-            </w:r>
-            <w:r>
-              <w:rPr>
-                <w:rFonts w:ascii="Arial Narrow" w:eastAsia="Times New Roman" w:hAnsi="Arial Narrow" w:cs="Calibri"/>
-                <w:color w:val="000000"/>
-                <w:sz w:val="20"/>
-                <w:szCs w:val="20"/>
-                <w:lang w:val="en-US" w:eastAsia="ko-KR"/>
-              </w:rPr>
-              <w:fldChar w:fldCharType="separate"/>
-            </w:r>
-            <w:r>
-              <w:rPr>
-                <w:rFonts w:ascii="Arial Narrow" w:eastAsia="Times New Roman" w:hAnsi="Arial Narrow" w:cs="Calibri"/>
-                <w:noProof/>
-                <w:color w:val="000000"/>
-                <w:sz w:val="20"/>
-                <w:szCs w:val="20"/>
-                <w:lang w:eastAsia="ko-KR"/>
-              </w:rPr>
-              <w:t>2025/2026</w:t>
-            </w:r>
-            <w:r>
-              <w:rPr>
-                <w:rFonts w:ascii="Arial Narrow" w:eastAsia="Times New Roman" w:hAnsi="Arial Narrow" w:cs="Calibri"/>
-                <w:color w:val="000000"/>
-                <w:sz w:val="20"/>
-                <w:szCs w:val="20"/>
-                <w:lang w:val="en-US" w:eastAsia="ko-KR"/>
-              </w:rPr>
-              <w:fldChar w:fldCharType="end"/>
+                <w:lang w:eastAsia="ko-KR"/>
+              </w:rPr>
+              <w:t>{TAHUN PELAJARAN}</w:t>
             </w:r>
             <w:r>
               <w:rPr>
@@ -5061,50 +4754,9 @@
                 <w:color w:val="000000"/>
                 <w:sz w:val="20"/>
                 <w:szCs w:val="20"/>
-                <w:lang w:val="en-US" w:eastAsia="ko-KR"/>
-              </w:rPr>
-              <w:fldChar w:fldCharType="begin"/>
-            </w:r>
-            <w:r>
-              <w:rPr>
-                <w:rFonts w:ascii="Arial Narrow" w:eastAsia="Times New Roman" w:hAnsi="Arial Narrow" w:cs="Calibri"/>
-                <w:color w:val="000000"/>
-                <w:sz w:val="20"/>
-                <w:szCs w:val="20"/>
-                <w:lang w:val="en-US" w:eastAsia="ko-KR"/>
-              </w:rPr>
-              <w:instrText xml:space="preserve"> MERGEFIELD "BERLAKU_" </w:instrText>
-            </w:r>
-            <w:r>
-              <w:rPr>
-                <w:rFonts w:ascii="Arial Narrow" w:eastAsia="Times New Roman" w:hAnsi="Arial Narrow" w:cs="Calibri"/>
-                <w:color w:val="000000"/>
-                <w:sz w:val="20"/>
-                <w:szCs w:val="20"/>
-                <w:lang w:val="en-US" w:eastAsia="ko-KR"/>
-              </w:rPr>
-              <w:fldChar w:fldCharType="separate"/>
-            </w:r>
-            <w:r>
-              <w:rPr>
-                <w:rFonts w:ascii="Arial Narrow" w:eastAsia="Times New Roman" w:hAnsi="Arial Narrow" w:cs="Calibri"/>
-                <w:noProof/>
-                <w:color w:val="000000"/>
-                <w:sz w:val="20"/>
-                <w:szCs w:val="20"/>
-                <w:lang w:val="en-US" w:eastAsia="ko-KR"/>
-              </w:rPr>
-              <w:t>01 Juli 2026</w:t>
-            </w:r>
-            <w:r>
-              <w:rPr>
-                <w:rFonts w:ascii="Arial Narrow" w:eastAsia="Times New Roman" w:hAnsi="Arial Narrow" w:cs="Calibri"/>
-                <w:color w:val="000000"/>
-                <w:sz w:val="20"/>
-                <w:szCs w:val="20"/>
-                <w:lang w:val="en-US" w:eastAsia="ko-KR"/>
-              </w:rPr>
-              <w:fldChar w:fldCharType="end"/>
+                <w:lang w:eastAsia="ko-KR"/>
+              </w:rPr>
+              <w:t>{TANGGAL_BERAKHIR}</w:t>
             </w:r>
             <w:r>
               <w:rPr>
@@ -5860,7 +5512,6 @@
           <w:rFonts w:ascii="Arial Narrow" w:hAnsi="Arial Narrow" w:cs="Times New Roman"/>
           <w:sz w:val="20"/>
           <w:szCs w:val="20"/>
-          <w:lang w:val="en-US"/>
         </w:rPr>
         <w:t xml:space="preserve">MWCNU </w:t>
       </w:r>
@@ -5878,7 +5529,6 @@
           <w:rFonts w:ascii="Arial Narrow" w:hAnsi="Arial Narrow" w:cs="Times New Roman"/>
           <w:sz w:val="20"/>
           <w:szCs w:val="20"/>
-          <w:lang w:val="en-US"/>
         </w:rPr>
         <w:instrText xml:space="preserve"> MERGEFIELD "KECAMATAN" </w:instrText>
       </w:r>
@@ -5897,7 +5547,6 @@
           <w:noProof/>
           <w:sz w:val="20"/>
           <w:szCs w:val="20"/>
-          <w:lang w:val="en-US"/>
         </w:rPr>
         <w:t>{KECAMATAN}</w:t>
       </w:r>

</xml_diff>